<commit_message>
Docs: put commands in bordered table cells in the setup guide
</commit_message>
<xml_diff>
--- a/documents/Huong dan cai dat va chay thi nghiem bang terminal (Windows).docx
+++ b/documents/Huong dan cai dat va chay thi nghiem bang terminal (Windows).docx
@@ -96,19 +96,41 @@
         <w:t>Tải bộ cài Python 3.10 tại trang chính thức:</w:t>
       </w:r>
     </w:p>
+    <w:tbl>
+      <w:tblPr>
+        <w:tblStyle w:val="TableGrid"/>
+        <w:tblW w:type="auto" w:w="0"/>
+        <w:tblLayout w:type="fixed"/>
+        <w:tblLook w:firstColumn="1" w:firstRow="1" w:lastColumn="0" w:lastRow="0" w:noHBand="0" w:noVBand="1" w:val="04A0"/>
+      </w:tblPr>
+      <w:tblGrid>
+        <w:gridCol w:w="8640"/>
+      </w:tblGrid>
+      <w:tr>
+        <w:tc>
+          <w:tcPr>
+            <w:tcW w:type="dxa" w:w="9072"/>
+            <w:shd w:val="clear" w:color="auto" w:fill="F2F2F2"/>
+          </w:tcPr>
+          <w:p>
+            <w:pPr>
+              <w:spacing w:before="20" w:after="20"/>
+            </w:pPr>
+            <w:r>
+              <w:rPr>
+                <w:rFonts w:ascii="Consolas" w:hAnsi="Consolas" w:cs="Consolas"/>
+                <w:sz w:val="20"/>
+              </w:rPr>
+              <w:t>https://www.python.org/downloads/</w:t>
+            </w:r>
+          </w:p>
+        </w:tc>
+      </w:tr>
+    </w:tbl>
     <w:p>
       <w:pPr>
-        <w:spacing w:before="80" w:after="160"/>
-        <w:ind w:left="120"/>
-        <w:shd w:val="clear" w:color="auto" w:fill="F2F2F2"/>
+        <w:spacing w:after="40"/>
       </w:pPr>
-      <w:r>
-        <w:rPr>
-          <w:rFonts w:ascii="Consolas" w:hAnsi="Consolas" w:cs="Consolas"/>
-          <w:sz w:val="20"/>
-        </w:rPr>
-        <w:t>https://www.python.org/downloads/</w:t>
-      </w:r>
     </w:p>
     <w:p>
       <w:pPr>
@@ -138,19 +160,41 @@
         <w:t>Kiểm tra cài đặt — mở một cửa sổ PowerShell MỚI và gõ:</w:t>
       </w:r>
     </w:p>
+    <w:tbl>
+      <w:tblPr>
+        <w:tblStyle w:val="TableGrid"/>
+        <w:tblW w:type="auto" w:w="0"/>
+        <w:tblLayout w:type="fixed"/>
+        <w:tblLook w:firstColumn="1" w:firstRow="1" w:lastColumn="0" w:lastRow="0" w:noHBand="0" w:noVBand="1" w:val="04A0"/>
+      </w:tblPr>
+      <w:tblGrid>
+        <w:gridCol w:w="8640"/>
+      </w:tblGrid>
+      <w:tr>
+        <w:tc>
+          <w:tcPr>
+            <w:tcW w:type="dxa" w:w="9072"/>
+            <w:shd w:val="clear" w:color="auto" w:fill="F2F2F2"/>
+          </w:tcPr>
+          <w:p>
+            <w:pPr>
+              <w:spacing w:before="20" w:after="20"/>
+            </w:pPr>
+            <w:r>
+              <w:rPr>
+                <w:rFonts w:ascii="Consolas" w:hAnsi="Consolas" w:cs="Consolas"/>
+                <w:sz w:val="20"/>
+              </w:rPr>
+              <w:t>python --version</w:t>
+            </w:r>
+          </w:p>
+        </w:tc>
+      </w:tr>
+    </w:tbl>
     <w:p>
       <w:pPr>
-        <w:spacing w:before="80" w:after="160"/>
-        <w:ind w:left="120"/>
-        <w:shd w:val="clear" w:color="auto" w:fill="F2F2F2"/>
+        <w:spacing w:after="40"/>
       </w:pPr>
-      <w:r>
-        <w:rPr>
-          <w:rFonts w:ascii="Consolas" w:hAnsi="Consolas" w:cs="Consolas"/>
-          <w:sz w:val="20"/>
-        </w:rPr>
-        <w:t>python --version</w:t>
-      </w:r>
     </w:p>
     <w:p>
       <w:pPr>
@@ -185,27 +229,61 @@
         <w:t>Cách A — nếu máy đã có Git (khuyến nghị):</w:t>
       </w:r>
     </w:p>
+    <w:tbl>
+      <w:tblPr>
+        <w:tblStyle w:val="TableGrid"/>
+        <w:tblW w:type="auto" w:w="0"/>
+        <w:tblLayout w:type="fixed"/>
+        <w:tblLook w:firstColumn="1" w:firstRow="1" w:lastColumn="0" w:lastRow="0" w:noHBand="0" w:noVBand="1" w:val="04A0"/>
+      </w:tblPr>
+      <w:tblGrid>
+        <w:gridCol w:w="8640"/>
+      </w:tblGrid>
+      <w:tr>
+        <w:tc>
+          <w:tcPr>
+            <w:tcW w:type="dxa" w:w="9072"/>
+            <w:shd w:val="clear" w:color="auto" w:fill="F2F2F2"/>
+          </w:tcPr>
+          <w:p>
+            <w:pPr>
+              <w:spacing w:before="20" w:after="20"/>
+            </w:pPr>
+            <w:r>
+              <w:rPr>
+                <w:rFonts w:ascii="Consolas" w:hAnsi="Consolas" w:cs="Consolas"/>
+                <w:sz w:val="20"/>
+              </w:rPr>
+              <w:t>git clone https://github.com/hmp94/Pipeline-for-analyzing-multimodal-neurophysiological-ndata.git</w:t>
+            </w:r>
+          </w:p>
+        </w:tc>
+      </w:tr>
+      <w:tr>
+        <w:tc>
+          <w:tcPr>
+            <w:tcW w:type="dxa" w:w="9072"/>
+            <w:shd w:val="clear" w:color="auto" w:fill="F2F2F2"/>
+          </w:tcPr>
+          <w:p>
+            <w:pPr>
+              <w:spacing w:before="20" w:after="20"/>
+            </w:pPr>
+            <w:r>
+              <w:rPr>
+                <w:rFonts w:ascii="Consolas" w:hAnsi="Consolas" w:cs="Consolas"/>
+                <w:sz w:val="20"/>
+              </w:rPr>
+              <w:t>cd Pipeline-for-analyzing-multimodal-neurophysiological-ndata</w:t>
+            </w:r>
+          </w:p>
+        </w:tc>
+      </w:tr>
+    </w:tbl>
     <w:p>
       <w:pPr>
-        <w:spacing w:before="80" w:after="160"/>
-        <w:ind w:left="120"/>
-        <w:shd w:val="clear" w:color="auto" w:fill="F2F2F2"/>
+        <w:spacing w:after="40"/>
       </w:pPr>
-      <w:r>
-        <w:rPr>
-          <w:rFonts w:ascii="Consolas" w:hAnsi="Consolas" w:cs="Consolas"/>
-          <w:sz w:val="20"/>
-        </w:rPr>
-        <w:t>git clone https://github.com/hmp94/Pipeline-for-analyzing-multimodal-neurophysiological-ndata.git</w:t>
-        <w:br/>
-      </w:r>
-      <w:r>
-        <w:rPr>
-          <w:rFonts w:ascii="Consolas" w:hAnsi="Consolas" w:cs="Consolas"/>
-          <w:sz w:val="20"/>
-        </w:rPr>
-        <w:t>cd Pipeline-for-analyzing-multimodal-neurophysiological-ndata</w:t>
-      </w:r>
     </w:p>
     <w:p>
       <w:r>
@@ -268,27 +346,61 @@
         <w:t>Trong PowerShell, tại thư mục dự án, tạo và kích hoạt môi trường tên “psychopy”:</w:t>
       </w:r>
     </w:p>
+    <w:tbl>
+      <w:tblPr>
+        <w:tblStyle w:val="TableGrid"/>
+        <w:tblW w:type="auto" w:w="0"/>
+        <w:tblLayout w:type="fixed"/>
+        <w:tblLook w:firstColumn="1" w:firstRow="1" w:lastColumn="0" w:lastRow="0" w:noHBand="0" w:noVBand="1" w:val="04A0"/>
+      </w:tblPr>
+      <w:tblGrid>
+        <w:gridCol w:w="8640"/>
+      </w:tblGrid>
+      <w:tr>
+        <w:tc>
+          <w:tcPr>
+            <w:tcW w:type="dxa" w:w="9072"/>
+            <w:shd w:val="clear" w:color="auto" w:fill="F2F2F2"/>
+          </w:tcPr>
+          <w:p>
+            <w:pPr>
+              <w:spacing w:before="20" w:after="20"/>
+            </w:pPr>
+            <w:r>
+              <w:rPr>
+                <w:rFonts w:ascii="Consolas" w:hAnsi="Consolas" w:cs="Consolas"/>
+                <w:sz w:val="20"/>
+              </w:rPr>
+              <w:t>py -3.10 -m venv psychopy</w:t>
+            </w:r>
+          </w:p>
+        </w:tc>
+      </w:tr>
+      <w:tr>
+        <w:tc>
+          <w:tcPr>
+            <w:tcW w:type="dxa" w:w="9072"/>
+            <w:shd w:val="clear" w:color="auto" w:fill="F2F2F2"/>
+          </w:tcPr>
+          <w:p>
+            <w:pPr>
+              <w:spacing w:before="20" w:after="20"/>
+            </w:pPr>
+            <w:r>
+              <w:rPr>
+                <w:rFonts w:ascii="Consolas" w:hAnsi="Consolas" w:cs="Consolas"/>
+                <w:sz w:val="20"/>
+              </w:rPr>
+              <w:t>.\psychopy\Scripts\Activate.ps1</w:t>
+            </w:r>
+          </w:p>
+        </w:tc>
+      </w:tr>
+    </w:tbl>
     <w:p>
       <w:pPr>
-        <w:spacing w:before="80" w:after="160"/>
-        <w:ind w:left="120"/>
-        <w:shd w:val="clear" w:color="auto" w:fill="F2F2F2"/>
+        <w:spacing w:after="40"/>
       </w:pPr>
-      <w:r>
-        <w:rPr>
-          <w:rFonts w:ascii="Consolas" w:hAnsi="Consolas" w:cs="Consolas"/>
-          <w:sz w:val="20"/>
-        </w:rPr>
-        <w:t>py -3.10 -m venv psychopy</w:t>
-        <w:br/>
-      </w:r>
-      <w:r>
-        <w:rPr>
-          <w:rFonts w:ascii="Consolas" w:hAnsi="Consolas" w:cs="Consolas"/>
-          <w:sz w:val="20"/>
-        </w:rPr>
-        <w:t>.\psychopy\Scripts\Activate.ps1</w:t>
-      </w:r>
     </w:p>
     <w:p>
       <w:pPr>
@@ -309,19 +421,41 @@
         <w:t>“running scripts is disabled on this system”: chạy lệnh sau MỘT LẦN, rồi kích hoạt lại bằng lệnh Activate ở trên:</w:t>
       </w:r>
     </w:p>
+    <w:tbl>
+      <w:tblPr>
+        <w:tblStyle w:val="TableGrid"/>
+        <w:tblW w:type="auto" w:w="0"/>
+        <w:tblLayout w:type="fixed"/>
+        <w:tblLook w:firstColumn="1" w:firstRow="1" w:lastColumn="0" w:lastRow="0" w:noHBand="0" w:noVBand="1" w:val="04A0"/>
+      </w:tblPr>
+      <w:tblGrid>
+        <w:gridCol w:w="8640"/>
+      </w:tblGrid>
+      <w:tr>
+        <w:tc>
+          <w:tcPr>
+            <w:tcW w:type="dxa" w:w="9072"/>
+            <w:shd w:val="clear" w:color="auto" w:fill="F2F2F2"/>
+          </w:tcPr>
+          <w:p>
+            <w:pPr>
+              <w:spacing w:before="20" w:after="20"/>
+            </w:pPr>
+            <w:r>
+              <w:rPr>
+                <w:rFonts w:ascii="Consolas" w:hAnsi="Consolas" w:cs="Consolas"/>
+                <w:sz w:val="20"/>
+              </w:rPr>
+              <w:t>Set-ExecutionPolicy -Scope CurrentUser RemoteSigned</w:t>
+            </w:r>
+          </w:p>
+        </w:tc>
+      </w:tr>
+    </w:tbl>
     <w:p>
       <w:pPr>
-        <w:spacing w:before="80" w:after="160"/>
-        <w:ind w:left="120"/>
-        <w:shd w:val="clear" w:color="auto" w:fill="F2F2F2"/>
+        <w:spacing w:after="40"/>
       </w:pPr>
-      <w:r>
-        <w:rPr>
-          <w:rFonts w:ascii="Consolas" w:hAnsi="Consolas" w:cs="Consolas"/>
-          <w:sz w:val="20"/>
-        </w:rPr>
-        <w:t>Set-ExecutionPolicy -Scope CurrentUser RemoteSigned</w:t>
-      </w:r>
     </w:p>
     <w:p>
       <w:pPr>
@@ -340,27 +474,61 @@
         <w:t>Đảm bảo dòng lệnh đang có (psychopy) ở đầu, rồi chạy:</w:t>
       </w:r>
     </w:p>
+    <w:tbl>
+      <w:tblPr>
+        <w:tblStyle w:val="TableGrid"/>
+        <w:tblW w:type="auto" w:w="0"/>
+        <w:tblLayout w:type="fixed"/>
+        <w:tblLook w:firstColumn="1" w:firstRow="1" w:lastColumn="0" w:lastRow="0" w:noHBand="0" w:noVBand="1" w:val="04A0"/>
+      </w:tblPr>
+      <w:tblGrid>
+        <w:gridCol w:w="8640"/>
+      </w:tblGrid>
+      <w:tr>
+        <w:tc>
+          <w:tcPr>
+            <w:tcW w:type="dxa" w:w="9072"/>
+            <w:shd w:val="clear" w:color="auto" w:fill="F2F2F2"/>
+          </w:tcPr>
+          <w:p>
+            <w:pPr>
+              <w:spacing w:before="20" w:after="20"/>
+            </w:pPr>
+            <w:r>
+              <w:rPr>
+                <w:rFonts w:ascii="Consolas" w:hAnsi="Consolas" w:cs="Consolas"/>
+                <w:sz w:val="20"/>
+              </w:rPr>
+              <w:t>python -m pip install --upgrade pip</w:t>
+            </w:r>
+          </w:p>
+        </w:tc>
+      </w:tr>
+      <w:tr>
+        <w:tc>
+          <w:tcPr>
+            <w:tcW w:type="dxa" w:w="9072"/>
+            <w:shd w:val="clear" w:color="auto" w:fill="F2F2F2"/>
+          </w:tcPr>
+          <w:p>
+            <w:pPr>
+              <w:spacing w:before="20" w:after="20"/>
+            </w:pPr>
+            <w:r>
+              <w:rPr>
+                <w:rFonts w:ascii="Consolas" w:hAnsi="Consolas" w:cs="Consolas"/>
+                <w:sz w:val="20"/>
+              </w:rPr>
+              <w:t>pip install psychopy</w:t>
+            </w:r>
+          </w:p>
+        </w:tc>
+      </w:tr>
+    </w:tbl>
     <w:p>
       <w:pPr>
-        <w:spacing w:before="80" w:after="160"/>
-        <w:ind w:left="120"/>
-        <w:shd w:val="clear" w:color="auto" w:fill="F2F2F2"/>
+        <w:spacing w:after="40"/>
       </w:pPr>
-      <w:r>
-        <w:rPr>
-          <w:rFonts w:ascii="Consolas" w:hAnsi="Consolas" w:cs="Consolas"/>
-          <w:sz w:val="20"/>
-        </w:rPr>
-        <w:t>python -m pip install --upgrade pip</w:t>
-        <w:br/>
-      </w:r>
-      <w:r>
-        <w:rPr>
-          <w:rFonts w:ascii="Consolas" w:hAnsi="Consolas" w:cs="Consolas"/>
-          <w:sz w:val="20"/>
-        </w:rPr>
-        <w:t>pip install psychopy</w:t>
-      </w:r>
     </w:p>
     <w:p>
       <w:pPr>
@@ -395,27 +563,61 @@
         <w:t>Chạy cả phiên đầy đủ (trạng thái nền + 6 nhiệm vụ theo thứ tự ngẫu nhiên):</w:t>
       </w:r>
     </w:p>
+    <w:tbl>
+      <w:tblPr>
+        <w:tblStyle w:val="TableGrid"/>
+        <w:tblW w:type="auto" w:w="0"/>
+        <w:tblLayout w:type="fixed"/>
+        <w:tblLook w:firstColumn="1" w:firstRow="1" w:lastColumn="0" w:lastRow="0" w:noHBand="0" w:noVBand="1" w:val="04A0"/>
+      </w:tblPr>
+      <w:tblGrid>
+        <w:gridCol w:w="8640"/>
+      </w:tblGrid>
+      <w:tr>
+        <w:tc>
+          <w:tcPr>
+            <w:tcW w:type="dxa" w:w="9072"/>
+            <w:shd w:val="clear" w:color="auto" w:fill="F2F2F2"/>
+          </w:tcPr>
+          <w:p>
+            <w:pPr>
+              <w:spacing w:before="20" w:after="20"/>
+            </w:pPr>
+            <w:r>
+              <w:rPr>
+                <w:rFonts w:ascii="Consolas" w:hAnsi="Consolas" w:cs="Consolas"/>
+                <w:sz w:val="20"/>
+              </w:rPr>
+              <w:t>cd code\experiment</w:t>
+            </w:r>
+          </w:p>
+        </w:tc>
+      </w:tr>
+      <w:tr>
+        <w:tc>
+          <w:tcPr>
+            <w:tcW w:type="dxa" w:w="9072"/>
+            <w:shd w:val="clear" w:color="auto" w:fill="F2F2F2"/>
+          </w:tcPr>
+          <w:p>
+            <w:pPr>
+              <w:spacing w:before="20" w:after="20"/>
+            </w:pPr>
+            <w:r>
+              <w:rPr>
+                <w:rFonts w:ascii="Consolas" w:hAnsi="Consolas" w:cs="Consolas"/>
+                <w:sz w:val="20"/>
+              </w:rPr>
+              <w:t>python run_all_experiments.py</w:t>
+            </w:r>
+          </w:p>
+        </w:tc>
+      </w:tr>
+    </w:tbl>
     <w:p>
       <w:pPr>
-        <w:spacing w:before="80" w:after="160"/>
-        <w:ind w:left="120"/>
-        <w:shd w:val="clear" w:color="auto" w:fill="F2F2F2"/>
+        <w:spacing w:after="40"/>
       </w:pPr>
-      <w:r>
-        <w:rPr>
-          <w:rFonts w:ascii="Consolas" w:hAnsi="Consolas" w:cs="Consolas"/>
-          <w:sz w:val="20"/>
-        </w:rPr>
-        <w:t>cd code\experiment</w:t>
-        <w:br/>
-      </w:r>
-      <w:r>
-        <w:rPr>
-          <w:rFonts w:ascii="Consolas" w:hAnsi="Consolas" w:cs="Consolas"/>
-          <w:sz w:val="20"/>
-        </w:rPr>
-        <w:t>python run_all_experiments.py</w:t>
-      </w:r>
     </w:p>
     <w:p>
       <w:pPr>
@@ -450,59 +652,141 @@
         <w:t>Chạy riêng từng nhiệm vụ (mỗi tệp tự hỏi thông tin người tham gia):</w:t>
       </w:r>
     </w:p>
+    <w:tbl>
+      <w:tblPr>
+        <w:tblStyle w:val="TableGrid"/>
+        <w:tblW w:type="auto" w:w="0"/>
+        <w:tblLayout w:type="fixed"/>
+        <w:tblLook w:firstColumn="1" w:firstRow="1" w:lastColumn="0" w:lastRow="0" w:noHBand="0" w:noVBand="1" w:val="04A0"/>
+      </w:tblPr>
+      <w:tblGrid>
+        <w:gridCol w:w="8640"/>
+      </w:tblGrid>
+      <w:tr>
+        <w:tc>
+          <w:tcPr>
+            <w:tcW w:type="dxa" w:w="9072"/>
+            <w:shd w:val="clear" w:color="auto" w:fill="F2F2F2"/>
+          </w:tcPr>
+          <w:p>
+            <w:pPr>
+              <w:spacing w:before="20" w:after="20"/>
+            </w:pPr>
+            <w:r>
+              <w:rPr>
+                <w:rFonts w:ascii="Consolas" w:hAnsi="Consolas" w:cs="Consolas"/>
+                <w:sz w:val="20"/>
+              </w:rPr>
+              <w:t>python passive_video_psychopy.py         # Quan sát video (thụ động)</w:t>
+            </w:r>
+          </w:p>
+        </w:tc>
+      </w:tr>
+      <w:tr>
+        <w:tc>
+          <w:tcPr>
+            <w:tcW w:type="dxa" w:w="9072"/>
+            <w:shd w:val="clear" w:color="auto" w:fill="F2F2F2"/>
+          </w:tcPr>
+          <w:p>
+            <w:pPr>
+              <w:spacing w:before="20" w:after="20"/>
+            </w:pPr>
+            <w:r>
+              <w:rPr>
+                <w:rFonts w:ascii="Consolas" w:hAnsi="Consolas" w:cs="Consolas"/>
+                <w:sz w:val="20"/>
+              </w:rPr>
+              <w:t>python fairy_tale_psychopy.py            # Đọc truyện</w:t>
+            </w:r>
+          </w:p>
+        </w:tc>
+      </w:tr>
+      <w:tr>
+        <w:tc>
+          <w:tcPr>
+            <w:tcW w:type="dxa" w:w="9072"/>
+            <w:shd w:val="clear" w:color="auto" w:fill="F2F2F2"/>
+          </w:tcPr>
+          <w:p>
+            <w:pPr>
+              <w:spacing w:before="20" w:after="20"/>
+            </w:pPr>
+            <w:r>
+              <w:rPr>
+                <w:rFonts w:ascii="Consolas" w:hAnsi="Consolas" w:cs="Consolas"/>
+                <w:sz w:val="20"/>
+              </w:rPr>
+              <w:t>python addition_game_psychopy.py         # Phép cộng</w:t>
+            </w:r>
+          </w:p>
+        </w:tc>
+      </w:tr>
+      <w:tr>
+        <w:tc>
+          <w:tcPr>
+            <w:tcW w:type="dxa" w:w="9072"/>
+            <w:shd w:val="clear" w:color="auto" w:fill="F2F2F2"/>
+          </w:tcPr>
+          <w:p>
+            <w:pPr>
+              <w:spacing w:before="20" w:after="20"/>
+            </w:pPr>
+            <w:r>
+              <w:rPr>
+                <w:rFonts w:ascii="Consolas" w:hAnsi="Consolas" w:cs="Consolas"/>
+                <w:sz w:val="20"/>
+              </w:rPr>
+              <w:t>python cpt_x_psychopy.py                 # CPT-X (chú ý)</w:t>
+            </w:r>
+          </w:p>
+        </w:tc>
+      </w:tr>
+      <w:tr>
+        <w:tc>
+          <w:tcPr>
+            <w:tcW w:type="dxa" w:w="9072"/>
+            <w:shd w:val="clear" w:color="auto" w:fill="F2F2F2"/>
+          </w:tcPr>
+          <w:p>
+            <w:pPr>
+              <w:spacing w:before="20" w:after="20"/>
+            </w:pPr>
+            <w:r>
+              <w:rPr>
+                <w:rFonts w:ascii="Consolas" w:hAnsi="Consolas" w:cs="Consolas"/>
+                <w:sz w:val="20"/>
+              </w:rPr>
+              <w:t>python multiplication_game_psychopy.py   # Phép nhân</w:t>
+            </w:r>
+          </w:p>
+        </w:tc>
+      </w:tr>
+      <w:tr>
+        <w:tc>
+          <w:tcPr>
+            <w:tcW w:type="dxa" w:w="9072"/>
+            <w:shd w:val="clear" w:color="auto" w:fill="F2F2F2"/>
+          </w:tcPr>
+          <w:p>
+            <w:pPr>
+              <w:spacing w:before="20" w:after="20"/>
+            </w:pPr>
+            <w:r>
+              <w:rPr>
+                <w:rFonts w:ascii="Consolas" w:hAnsi="Consolas" w:cs="Consolas"/>
+                <w:sz w:val="20"/>
+              </w:rPr>
+              <w:t>python stroop_game_psychopy.py           # Stroop</w:t>
+            </w:r>
+          </w:p>
+        </w:tc>
+      </w:tr>
+    </w:tbl>
     <w:p>
       <w:pPr>
-        <w:spacing w:before="80" w:after="160"/>
-        <w:ind w:left="120"/>
-        <w:shd w:val="clear" w:color="auto" w:fill="F2F2F2"/>
+        <w:spacing w:after="40"/>
       </w:pPr>
-      <w:r>
-        <w:rPr>
-          <w:rFonts w:ascii="Consolas" w:hAnsi="Consolas" w:cs="Consolas"/>
-          <w:sz w:val="20"/>
-        </w:rPr>
-        <w:t>python passive_video_psychopy.py         # Quan sát video (thụ động)</w:t>
-        <w:br/>
-      </w:r>
-      <w:r>
-        <w:rPr>
-          <w:rFonts w:ascii="Consolas" w:hAnsi="Consolas" w:cs="Consolas"/>
-          <w:sz w:val="20"/>
-        </w:rPr>
-        <w:t>python fairy_tale_psychopy.py            # Đọc truyện</w:t>
-        <w:br/>
-      </w:r>
-      <w:r>
-        <w:rPr>
-          <w:rFonts w:ascii="Consolas" w:hAnsi="Consolas" w:cs="Consolas"/>
-          <w:sz w:val="20"/>
-        </w:rPr>
-        <w:t>python addition_game_psychopy.py         # Phép cộng</w:t>
-        <w:br/>
-      </w:r>
-      <w:r>
-        <w:rPr>
-          <w:rFonts w:ascii="Consolas" w:hAnsi="Consolas" w:cs="Consolas"/>
-          <w:sz w:val="20"/>
-        </w:rPr>
-        <w:t>python cpt_x_psychopy.py                 # CPT-X (chú ý)</w:t>
-        <w:br/>
-      </w:r>
-      <w:r>
-        <w:rPr>
-          <w:rFonts w:ascii="Consolas" w:hAnsi="Consolas" w:cs="Consolas"/>
-          <w:sz w:val="20"/>
-        </w:rPr>
-        <w:t>python multiplication_game_psychopy.py   # Phép nhân</w:t>
-        <w:br/>
-      </w:r>
-      <w:r>
-        <w:rPr>
-          <w:rFonts w:ascii="Consolas" w:hAnsi="Consolas" w:cs="Consolas"/>
-          <w:sz w:val="20"/>
-        </w:rPr>
-        <w:t>python stroop_game_psychopy.py           # Stroop</w:t>
-      </w:r>
     </w:p>
     <w:p>
       <w:pPr>
@@ -521,19 +805,41 @@
         <w:t>Mỗi phiên tạo một thư mục riêng bên trong:</w:t>
       </w:r>
     </w:p>
+    <w:tbl>
+      <w:tblPr>
+        <w:tblStyle w:val="TableGrid"/>
+        <w:tblW w:type="auto" w:w="0"/>
+        <w:tblLayout w:type="fixed"/>
+        <w:tblLook w:firstColumn="1" w:firstRow="1" w:lastColumn="0" w:lastRow="0" w:noHBand="0" w:noVBand="1" w:val="04A0"/>
+      </w:tblPr>
+      <w:tblGrid>
+        <w:gridCol w:w="8640"/>
+      </w:tblGrid>
+      <w:tr>
+        <w:tc>
+          <w:tcPr>
+            <w:tcW w:type="dxa" w:w="9072"/>
+            <w:shd w:val="clear" w:color="auto" w:fill="F2F2F2"/>
+          </w:tcPr>
+          <w:p>
+            <w:pPr>
+              <w:spacing w:before="20" w:after="20"/>
+            </w:pPr>
+            <w:r>
+              <w:rPr>
+                <w:rFonts w:ascii="Consolas" w:hAnsi="Consolas" w:cs="Consolas"/>
+                <w:sz w:val="20"/>
+              </w:rPr>
+              <w:t>code\results\&lt;tên người tham gia&gt;_&lt;thời gian&gt;\</w:t>
+            </w:r>
+          </w:p>
+        </w:tc>
+      </w:tr>
+    </w:tbl>
     <w:p>
       <w:pPr>
-        <w:spacing w:before="80" w:after="160"/>
-        <w:ind w:left="120"/>
-        <w:shd w:val="clear" w:color="auto" w:fill="F2F2F2"/>
+        <w:spacing w:after="40"/>
       </w:pPr>
-      <w:r>
-        <w:rPr>
-          <w:rFonts w:ascii="Consolas" w:hAnsi="Consolas" w:cs="Consolas"/>
-          <w:sz w:val="20"/>
-        </w:rPr>
-        <w:t>code\results\&lt;tên người tham gia&gt;_&lt;thời gian&gt;\</w:t>
-      </w:r>
     </w:p>
     <w:p>
       <w:pPr>
@@ -600,35 +906,81 @@
         <w:t>Không cần cài lại. Chỉ cần mở PowerShell tại thư mục dự án và chạy:</w:t>
       </w:r>
     </w:p>
+    <w:tbl>
+      <w:tblPr>
+        <w:tblStyle w:val="TableGrid"/>
+        <w:tblW w:type="auto" w:w="0"/>
+        <w:tblLayout w:type="fixed"/>
+        <w:tblLook w:firstColumn="1" w:firstRow="1" w:lastColumn="0" w:lastRow="0" w:noHBand="0" w:noVBand="1" w:val="04A0"/>
+      </w:tblPr>
+      <w:tblGrid>
+        <w:gridCol w:w="8640"/>
+      </w:tblGrid>
+      <w:tr>
+        <w:tc>
+          <w:tcPr>
+            <w:tcW w:type="dxa" w:w="9072"/>
+            <w:shd w:val="clear" w:color="auto" w:fill="F2F2F2"/>
+          </w:tcPr>
+          <w:p>
+            <w:pPr>
+              <w:spacing w:before="20" w:after="20"/>
+            </w:pPr>
+            <w:r>
+              <w:rPr>
+                <w:rFonts w:ascii="Consolas" w:hAnsi="Consolas" w:cs="Consolas"/>
+                <w:sz w:val="20"/>
+              </w:rPr>
+              <w:t>.\psychopy\Scripts\Activate.ps1</w:t>
+            </w:r>
+          </w:p>
+        </w:tc>
+      </w:tr>
+      <w:tr>
+        <w:tc>
+          <w:tcPr>
+            <w:tcW w:type="dxa" w:w="9072"/>
+            <w:shd w:val="clear" w:color="auto" w:fill="F2F2F2"/>
+          </w:tcPr>
+          <w:p>
+            <w:pPr>
+              <w:spacing w:before="20" w:after="20"/>
+            </w:pPr>
+            <w:r>
+              <w:rPr>
+                <w:rFonts w:ascii="Consolas" w:hAnsi="Consolas" w:cs="Consolas"/>
+                <w:sz w:val="20"/>
+              </w:rPr>
+              <w:t>cd code\experiment</w:t>
+            </w:r>
+          </w:p>
+        </w:tc>
+      </w:tr>
+      <w:tr>
+        <w:tc>
+          <w:tcPr>
+            <w:tcW w:type="dxa" w:w="9072"/>
+            <w:shd w:val="clear" w:color="auto" w:fill="F2F2F2"/>
+          </w:tcPr>
+          <w:p>
+            <w:pPr>
+              <w:spacing w:before="20" w:after="20"/>
+            </w:pPr>
+            <w:r>
+              <w:rPr>
+                <w:rFonts w:ascii="Consolas" w:hAnsi="Consolas" w:cs="Consolas"/>
+                <w:sz w:val="20"/>
+              </w:rPr>
+              <w:t>python run_all_experiments.py</w:t>
+            </w:r>
+          </w:p>
+        </w:tc>
+      </w:tr>
+    </w:tbl>
     <w:p>
       <w:pPr>
-        <w:spacing w:before="80" w:after="160"/>
-        <w:ind w:left="120"/>
-        <w:shd w:val="clear" w:color="auto" w:fill="F2F2F2"/>
+        <w:spacing w:after="40"/>
       </w:pPr>
-      <w:r>
-        <w:rPr>
-          <w:rFonts w:ascii="Consolas" w:hAnsi="Consolas" w:cs="Consolas"/>
-          <w:sz w:val="20"/>
-        </w:rPr>
-        <w:t>.\psychopy\Scripts\Activate.ps1</w:t>
-        <w:br/>
-      </w:r>
-      <w:r>
-        <w:rPr>
-          <w:rFonts w:ascii="Consolas" w:hAnsi="Consolas" w:cs="Consolas"/>
-          <w:sz w:val="20"/>
-        </w:rPr>
-        <w:t>cd code\experiment</w:t>
-        <w:br/>
-      </w:r>
-      <w:r>
-        <w:rPr>
-          <w:rFonts w:ascii="Consolas" w:hAnsi="Consolas" w:cs="Consolas"/>
-          <w:sz w:val="20"/>
-        </w:rPr>
-        <w:t>python run_all_experiments.py</w:t>
-      </w:r>
     </w:p>
     <w:p>
       <w:pPr>

</xml_diff>